<commit_message>
docs: actualizar informe tecnico PDF y DOCX con captura real de cascada de trazas Jaeger
</commit_message>
<xml_diff>
--- a/docs/INFORME_TECNICO.docx
+++ b/docs/INFORME_TECNICO.docx
@@ -7,7 +7,7 @@
         <w:pStyle w:val="Title"/>
       </w:pPr>
       <w:r>
-        <w:t xml:space="preserve">Informe Técnico — Pipeline de Observabilidad End-to-End con OpenTelemetry</w:t>
+        <w:t xml:space="preserve">Laboratorio: Pipeline de Observabilidad End-to-End con OpenTelemetry</w:t>
       </w:r>
     </w:p>
     <w:p>
@@ -52,7 +52,7 @@
         </w:p>
       </w:sdtContent>
     </w:sdt>
-    <w:bookmarkStart w:id="95" w:name="X5b2ce465ab136bb935a832ee27e9a3121fa295f"/>
+    <w:bookmarkStart w:id="98" w:name="X5b2ce465ab136bb935a832ee27e9a3121fa295f"/>
     <w:p>
       <w:pPr>
         <w:pStyle w:val="Heading1"/>
@@ -7924,7 +7924,7 @@
     </w:p>
     <w:bookmarkEnd w:id="76"/>
     <w:bookmarkEnd w:id="77"/>
-    <w:bookmarkStart w:id="91" w:name="Xc5f00ff4202643de49c428bd161bbbb353ae39a"/>
+    <w:bookmarkStart w:id="94" w:name="Xc5f00ff4202643de49c428bd161bbbb353ae39a"/>
     <w:p>
       <w:pPr>
         <w:pStyle w:val="Heading2"/>
@@ -8025,7 +8025,7 @@
       </w:r>
     </w:p>
     <w:bookmarkEnd w:id="81"/>
-    <w:bookmarkStart w:id="82" w:name="X847f89262677fca07b8dcb704986ce57e581885"/>
+    <w:bookmarkStart w:id="85" w:name="X847f89262677fca07b8dcb704986ce57e581885"/>
     <w:p>
       <w:pPr>
         <w:pStyle w:val="Heading3"/>
@@ -8104,7 +8104,46 @@
         <w:pStyle w:val="BodyText"/>
       </w:pPr>
       <w:r>
-        <w:t xml:space="preserve">Jaeger Trace Detail</w:t>
+        <w:drawing>
+          <wp:inline>
+            <wp:extent cx="5334000" cy="2914069"/>
+            <wp:effectExtent b="0" l="0" r="0" t="0"/>
+            <wp:docPr descr="Jaeger Trace Detail" title="" id="83" name="Picture"/>
+            <a:graphic>
+              <a:graphicData uri="http://schemas.openxmlformats.org/drawingml/2006/picture">
+                <pic:pic>
+                  <pic:nvPicPr>
+                    <pic:cNvPr descr="docs/screenshots/jaeger-trace-detail.png" id="84" name="Picture"/>
+                    <pic:cNvPicPr>
+                      <a:picLocks noChangeArrowheads="1" noChangeAspect="1"/>
+                    </pic:cNvPicPr>
+                  </pic:nvPicPr>
+                  <pic:blipFill>
+                    <a:blip r:embed="rId82"/>
+                    <a:stretch>
+                      <a:fillRect/>
+                    </a:stretch>
+                  </pic:blipFill>
+                  <pic:spPr bwMode="auto">
+                    <a:xfrm>
+                      <a:off x="0" y="0"/>
+                      <a:ext cx="5334000" cy="2914069"/>
+                    </a:xfrm>
+                    <a:prstGeom prst="rect">
+                      <a:avLst/>
+                    </a:prstGeom>
+                    <a:noFill/>
+                    <a:ln w="9525">
+                      <a:noFill/>
+                      <a:headEnd/>
+                      <a:tailEnd/>
+                    </a:ln>
+                  </pic:spPr>
+                </pic:pic>
+              </a:graphicData>
+            </a:graphic>
+          </wp:inline>
+        </w:drawing>
       </w:r>
     </w:p>
     <w:p>
@@ -8257,8 +8296,8 @@
         <w:t xml:space="preserve">db.statement</w:t>
       </w:r>
     </w:p>
-    <w:bookmarkEnd w:id="82"/>
-    <w:bookmarkStart w:id="86" w:name="Xeb34b56c13f551000aa295d2cd0bb3e38c2d3d4"/>
+    <w:bookmarkEnd w:id="85"/>
+    <w:bookmarkStart w:id="89" w:name="Xeb34b56c13f551000aa295d2cd0bb3e38c2d3d4"/>
     <w:p>
       <w:pPr>
         <w:pStyle w:val="Heading3"/>
@@ -8284,18 +8323,18 @@
           <wp:inline>
             <wp:extent cx="5334000" cy="3000375"/>
             <wp:effectExtent b="0" l="0" r="0" t="0"/>
-            <wp:docPr descr="Grafana Dashboard" title="" id="84" name="Picture"/>
+            <wp:docPr descr="Grafana Dashboard" title="" id="87" name="Picture"/>
             <a:graphic>
               <a:graphicData uri="http://schemas.openxmlformats.org/drawingml/2006/picture">
                 <pic:pic>
                   <pic:nvPicPr>
-                    <pic:cNvPr descr="docs/screenshots/grafana-dashboard.png" id="85" name="Picture"/>
+                    <pic:cNvPr descr="docs/screenshots/grafana-dashboard.png" id="88" name="Picture"/>
                     <pic:cNvPicPr>
                       <a:picLocks noChangeArrowheads="1" noChangeAspect="1"/>
                     </pic:cNvPicPr>
                   </pic:nvPicPr>
                   <pic:blipFill>
-                    <a:blip r:embed="rId83"/>
+                    <a:blip r:embed="rId86"/>
                     <a:stretch>
                       <a:fillRect/>
                     </a:stretch>
@@ -8322,8 +8361,8 @@
         </w:drawing>
       </w:r>
     </w:p>
-    <w:bookmarkEnd w:id="86"/>
-    <w:bookmarkStart w:id="90" w:name="X759a72939be7f3a64c831c30092c5026c625848"/>
+    <w:bookmarkEnd w:id="89"/>
+    <w:bookmarkStart w:id="93" w:name="X759a72939be7f3a64c831c30092c5026c625848"/>
     <w:p>
       <w:pPr>
         <w:pStyle w:val="Heading3"/>
@@ -8364,18 +8403,18 @@
           <wp:inline>
             <wp:extent cx="5334000" cy="3000375"/>
             <wp:effectExtent b="0" l="0" r="0" t="0"/>
-            <wp:docPr descr="Swagger UI" title="" id="88" name="Picture"/>
+            <wp:docPr descr="Swagger UI" title="" id="91" name="Picture"/>
             <a:graphic>
               <a:graphicData uri="http://schemas.openxmlformats.org/drawingml/2006/picture">
                 <pic:pic>
                   <pic:nvPicPr>
-                    <pic:cNvPr descr="docs/screenshots/swagger-ui.png" id="89" name="Picture"/>
+                    <pic:cNvPr descr="docs/screenshots/swagger-ui.png" id="92" name="Picture"/>
                     <pic:cNvPicPr>
                       <a:picLocks noChangeArrowheads="1" noChangeAspect="1"/>
                     </pic:cNvPicPr>
                   </pic:nvPicPr>
                   <pic:blipFill>
-                    <a:blip r:embed="rId87"/>
+                    <a:blip r:embed="rId90"/>
                     <a:stretch>
                       <a:fillRect/>
                     </a:stretch>
@@ -8409,9 +8448,9 @@
         </w:pict>
       </w:r>
     </w:p>
-    <w:bookmarkEnd w:id="90"/>
-    <w:bookmarkEnd w:id="91"/>
-    <w:bookmarkStart w:id="92" w:name="Xf3f5420b0c6856bab0159724e78edff99c093e4"/>
+    <w:bookmarkEnd w:id="93"/>
+    <w:bookmarkEnd w:id="94"/>
+    <w:bookmarkStart w:id="95" w:name="Xf3f5420b0c6856bab0159724e78edff99c093e4"/>
     <w:p>
       <w:pPr>
         <w:pStyle w:val="Heading2"/>
@@ -8897,8 +8936,8 @@
         </w:pict>
       </w:r>
     </w:p>
-    <w:bookmarkEnd w:id="92"/>
-    <w:bookmarkStart w:id="93" w:name="X812d556d61c7aa1092531b8dd2f29259d157429"/>
+    <w:bookmarkEnd w:id="95"/>
+    <w:bookmarkStart w:id="96" w:name="X812d556d61c7aa1092531b8dd2f29259d157429"/>
     <w:p>
       <w:pPr>
         <w:pStyle w:val="Heading2"/>
@@ -9243,8 +9282,8 @@
         </w:pict>
       </w:r>
     </w:p>
-    <w:bookmarkEnd w:id="93"/>
-    <w:bookmarkStart w:id="94" w:name="Xe0dd44fb2a5f0bbd744f579b136182eecb2e69a"/>
+    <w:bookmarkEnd w:id="96"/>
+    <w:bookmarkStart w:id="97" w:name="Xe0dd44fb2a5f0bbd744f579b136182eecb2e69a"/>
     <w:p>
       <w:pPr>
         <w:pStyle w:val="Heading2"/>
@@ -9422,8 +9461,8 @@
         <w:t xml:space="preserve">.</w:t>
       </w:r>
     </w:p>
-    <w:bookmarkEnd w:id="94"/>
-    <w:bookmarkEnd w:id="95"/>
+    <w:bookmarkEnd w:id="97"/>
+    <w:bookmarkEnd w:id="98"/>
     <w:sectPr>
       <w:footnotePr>
         <w:numRestart w:val="eachSect"/>

</xml_diff>